<commit_message>
site: name 2351485 ALBERTA INC. — footer © line on all pages + operator paragraph in privacy body (compliance fix 2026-10-25, gate certified)
</commit_message>
<xml_diff>
--- a/site/dist/paperwork/paperwork-privacy.docx
+++ b/site/dist/paperwork/paperwork-privacy.docx
@@ -69,6 +69,17 @@
     <w:p>
       <w:r>
         <w:t>Download as Word (.docx) (/paperwork/paperwork-privacy.docx)</w:t>
+      </w:r>
+    </w:p>
+    <w:p>
+      <w:r>
+        <w:rPr>
+          <w:b/>
+        </w:rPr>
+        <w:t>Operator:</w:t>
+      </w:r>
+      <w:r>
+        <w:t xml:space="preserve"> AxiomCode is a service of 2351485 ALBERTA INC., a corporation registered in Alberta, Canada (“we”, “us”). This policy describes how 2351485 ALBERTA INC. collects, uses, and retains information when you use AxiomCode.</w:t>
       </w:r>
     </w:p>
     <w:p>

</xml_diff>